<commit_message>
Update dashboard to V10 with Azure PostgreSQL support
</commit_message>
<xml_diff>
--- a/public/manuals/CNS-HIAA-KPI-Dashboard-IT-Technical-Guide.docx
+++ b/public/manuals/CNS-HIAA-KPI-Dashboard-IT-Technical-Guide.docx
@@ -127,7 +127,7 @@
           <w:sz w:val="21"/>
           <w:szCs w:val="21"/>
         </w:rPr>
-        <w:t xml:space="preserve">The CNS HIAA Airport KPI Dashboard is a Next.js (App Router) application deployed on Vercel. It reads 21 KPI workbooks (KPI-01 … KPI-21) from SharePoint (or bundled local fallbacks), computes each KPI and an overall portfolio status server-side, and renders responsive dashboards, an executive summary, printable reports, and a notification system backed by Neon Postgres.</w:t>
+        <w:t xml:space="preserve">The CNS HIAA Airport KPI Dashboard is a Next.js (App Router) application. It reads 21 KPI workbooks (KPI-01 … KPI-21) from SharePoint (or bundled local fallbacks), computes each KPI and an overall portfolio status server-side, and renders responsive dashboards, an executive summary, printable reports, and a notification system backed by Azure Database for PostgreSQL Flexible Server.</w:t>
       </w:r>
     </w:p>
     <w:tbl>
@@ -526,7 +526,7 @@
                 <w:sz w:val="19"/>
                 <w:szCs w:val="19"/>
               </w:rPr>
-              <w:t xml:space="preserve">Neon Postgres with Drizzle ORM</w:t>
+              <w:t xml:space="preserve">Azure Database for PostgreSQL Flexible Server (Canada East) with Drizzle ORM</w:t>
             </w:r>
           </w:p>
         </w:tc>
@@ -1701,7 +1701,7 @@
                 <w:sz w:val="19"/>
                 <w:szCs w:val="19"/>
               </w:rPr>
-              <w:t xml:space="preserve">Neon Postgres connection string (auto-provisioned by the Neon integration).</w:t>
+              <w:t xml:space="preserve">Azure Database for PostgreSQL Flexible Server connection string (TLS required).</w:t>
             </w:r>
           </w:p>
         </w:tc>
@@ -1724,12 +1724,167 @@
                 <w:sz w:val="19"/>
                 <w:szCs w:val="19"/>
               </w:rPr>
+              <w:t xml:space="preserve">AZURE_PG_USE_ENTRA</w:t>
+            </w:r>
+          </w:p>
+        </w:tc>
+        <w:tc>
+          <w:tcPr>
+            <w:shd w:fill="F6F8FC" w:color="auto" w:val="clear"/>
+            <w:tcMar>
+              <w:top w:type="dxa" w:w="70"/>
+              <w:left w:type="dxa" w:w="120"/>
+              <w:bottom w:type="dxa" w:w="70"/>
+              <w:right w:type="dxa" w:w="120"/>
+            </w:tcMar>
+          </w:tcPr>
+          <w:p>
+            <w:r>
+              <w:rPr>
+                <w:color w:val="222933"/>
+                <w:sz w:val="19"/>
+                <w:szCs w:val="19"/>
+              </w:rPr>
+              <w:t xml:space="preserve">true to authenticate via Microsoft Entra ID managed-identity tokens instead of a password.</w:t>
+            </w:r>
+          </w:p>
+        </w:tc>
+      </w:tr>
+      <w:tr>
+        <w:tc>
+          <w:tcPr>
+            <w:shd w:fill="FFFFFF" w:color="auto" w:val="clear"/>
+            <w:tcMar>
+              <w:top w:type="dxa" w:w="70"/>
+              <w:left w:type="dxa" w:w="120"/>
+              <w:bottom w:type="dxa" w:w="70"/>
+              <w:right w:type="dxa" w:w="120"/>
+            </w:tcMar>
+          </w:tcPr>
+          <w:p>
+            <w:r>
+              <w:rPr>
+                <w:color w:val="222933"/>
+                <w:sz w:val="19"/>
+                <w:szCs w:val="19"/>
+              </w:rPr>
+              <w:t xml:space="preserve">AZURE_PG_SSL_CA</w:t>
+            </w:r>
+          </w:p>
+        </w:tc>
+        <w:tc>
+          <w:tcPr>
+            <w:shd w:fill="FFFFFF" w:color="auto" w:val="clear"/>
+            <w:tcMar>
+              <w:top w:type="dxa" w:w="70"/>
+              <w:left w:type="dxa" w:w="120"/>
+              <w:bottom w:type="dxa" w:w="70"/>
+              <w:right w:type="dxa" w:w="120"/>
+            </w:tcMar>
+          </w:tcPr>
+          <w:p>
+            <w:r>
+              <w:rPr>
+                <w:color w:val="222933"/>
+                <w:sz w:val="19"/>
+                <w:szCs w:val="19"/>
+              </w:rPr>
+              <w:t xml:space="preserve">Optional CA bundle (PEM or file path) for verify-full TLS; blank uses Node's trust store.</w:t>
+            </w:r>
+          </w:p>
+        </w:tc>
+      </w:tr>
+      <w:tr>
+        <w:tc>
+          <w:tcPr>
+            <w:shd w:fill="F6F8FC" w:color="auto" w:val="clear"/>
+            <w:tcMar>
+              <w:top w:type="dxa" w:w="70"/>
+              <w:left w:type="dxa" w:w="120"/>
+              <w:bottom w:type="dxa" w:w="70"/>
+              <w:right w:type="dxa" w:w="120"/>
+            </w:tcMar>
+          </w:tcPr>
+          <w:p>
+            <w:r>
+              <w:rPr>
+                <w:color w:val="222933"/>
+                <w:sz w:val="19"/>
+                <w:szCs w:val="19"/>
+              </w:rPr>
+              <w:t xml:space="preserve">AUTH_REQUIRE_ENTRA</w:t>
+            </w:r>
+          </w:p>
+        </w:tc>
+        <w:tc>
+          <w:tcPr>
+            <w:shd w:fill="F6F8FC" w:color="auto" w:val="clear"/>
+            <w:tcMar>
+              <w:top w:type="dxa" w:w="70"/>
+              <w:left w:type="dxa" w:w="120"/>
+              <w:bottom w:type="dxa" w:w="70"/>
+              <w:right w:type="dxa" w:w="120"/>
+            </w:tcMar>
+          </w:tcPr>
+          <w:p>
+            <w:r>
+              <w:rPr>
+                <w:color w:val="222933"/>
+                <w:sz w:val="19"/>
+                <w:szCs w:val="19"/>
+              </w:rPr>
+              <w:t xml:space="preserve">true in production to force Entra sign-in (proxy redirects unauthenticated page requests).</w:t>
+            </w:r>
+          </w:p>
+        </w:tc>
+      </w:tr>
+      <w:tr>
+        <w:tc>
+          <w:tcPr>
+            <w:shd w:fill="FFFFFF" w:color="auto" w:val="clear"/>
+            <w:tcMar>
+              <w:top w:type="dxa" w:w="70"/>
+              <w:left w:type="dxa" w:w="120"/>
+              <w:bottom w:type="dxa" w:w="70"/>
+              <w:right w:type="dxa" w:w="120"/>
+            </w:tcMar>
+          </w:tcPr>
+          <w:p>
+            <w:r>
+              <w:rPr>
+                <w:color w:val="222933"/>
+                <w:sz w:val="19"/>
+                <w:szCs w:val="19"/>
+              </w:rPr>
               <w:t xml:space="preserve">NOTIFY_DEV_USER_ID / _EMAIL / _NAME / _ROLE</w:t>
             </w:r>
           </w:p>
         </w:tc>
         <w:tc>
           <w:tcPr>
+            <w:shd w:fill="FFFFFF" w:color="auto" w:val="clear"/>
+            <w:tcMar>
+              <w:top w:type="dxa" w:w="70"/>
+              <w:left w:type="dxa" w:w="120"/>
+              <w:bottom w:type="dxa" w:w="70"/>
+              <w:right w:type="dxa" w:w="120"/>
+            </w:tcMar>
+          </w:tcPr>
+          <w:p>
+            <w:r>
+              <w:rPr>
+                <w:color w:val="222933"/>
+                <w:sz w:val="19"/>
+                <w:szCs w:val="19"/>
+              </w:rPr>
+              <w:t xml:space="preserve">Local dev fallback identity, used only when no Easy Auth principal is present.</w:t>
+            </w:r>
+          </w:p>
+        </w:tc>
+      </w:tr>
+      <w:tr>
+        <w:tc>
+          <w:tcPr>
             <w:shd w:fill="F6F8FC" w:color="auto" w:val="clear"/>
             <w:tcMar>
               <w:top w:type="dxa" w:w="70"/>
@@ -1745,36 +1900,13 @@
                 <w:sz w:val="19"/>
                 <w:szCs w:val="19"/>
               </w:rPr>
-              <w:t xml:space="preserve">Dev identity until Entra sign-in is wired in.</w:t>
-            </w:r>
-          </w:p>
-        </w:tc>
-      </w:tr>
-      <w:tr>
-        <w:tc>
-          <w:tcPr>
-            <w:shd w:fill="FFFFFF" w:color="auto" w:val="clear"/>
-            <w:tcMar>
-              <w:top w:type="dxa" w:w="70"/>
-              <w:left w:type="dxa" w:w="120"/>
-              <w:bottom w:type="dxa" w:w="70"/>
-              <w:right w:type="dxa" w:w="120"/>
-            </w:tcMar>
-          </w:tcPr>
-          <w:p>
-            <w:r>
-              <w:rPr>
-                <w:color w:val="222933"/>
-                <w:sz w:val="19"/>
-                <w:szCs w:val="19"/>
-              </w:rPr>
               <w:t xml:space="preserve">NOTIFY_EVALUATE_SECRET</w:t>
             </w:r>
           </w:p>
         </w:tc>
         <w:tc>
           <w:tcPr>
-            <w:shd w:fill="FFFFFF" w:color="auto" w:val="clear"/>
+            <w:shd w:fill="F6F8FC" w:color="auto" w:val="clear"/>
             <w:tcMar>
               <w:top w:type="dxa" w:w="70"/>
               <w:left w:type="dxa" w:w="120"/>
@@ -1797,6 +1929,50 @@
       <w:tr>
         <w:tc>
           <w:tcPr>
+            <w:shd w:fill="FFFFFF" w:color="auto" w:val="clear"/>
+            <w:tcMar>
+              <w:top w:type="dxa" w:w="70"/>
+              <w:left w:type="dxa" w:w="120"/>
+              <w:bottom w:type="dxa" w:w="70"/>
+              <w:right w:type="dxa" w:w="120"/>
+            </w:tcMar>
+          </w:tcPr>
+          <w:p>
+            <w:r>
+              <w:rPr>
+                <w:color w:val="222933"/>
+                <w:sz w:val="19"/>
+                <w:szCs w:val="19"/>
+              </w:rPr>
+              <w:t xml:space="preserve">NOTIFY_EMAIL_ENABLED</w:t>
+            </w:r>
+          </w:p>
+        </w:tc>
+        <w:tc>
+          <w:tcPr>
+            <w:shd w:fill="FFFFFF" w:color="auto" w:val="clear"/>
+            <w:tcMar>
+              <w:top w:type="dxa" w:w="70"/>
+              <w:left w:type="dxa" w:w="120"/>
+              <w:bottom w:type="dxa" w:w="70"/>
+              <w:right w:type="dxa" w:w="120"/>
+            </w:tcMar>
+          </w:tcPr>
+          <w:p>
+            <w:r>
+              <w:rPr>
+                <w:color w:val="222933"/>
+                <w:sz w:val="19"/>
+                <w:szCs w:val="19"/>
+              </w:rPr>
+              <w:t xml:space="preserve">Feature flag for Outlook email delivery (default false).</w:t>
+            </w:r>
+          </w:p>
+        </w:tc>
+      </w:tr>
+      <w:tr>
+        <w:tc>
+          <w:tcPr>
             <w:shd w:fill="F6F8FC" w:color="auto" w:val="clear"/>
             <w:tcMar>
               <w:top w:type="dxa" w:w="70"/>
@@ -1812,7 +1988,7 @@
                 <w:sz w:val="19"/>
                 <w:szCs w:val="19"/>
               </w:rPr>
-              <w:t xml:space="preserve">NOTIFY_EMAIL_ENABLED</w:t>
+              <w:t xml:space="preserve">NOTIFY_TEAMS_ENABLED</w:t>
             </w:r>
           </w:p>
         </w:tc>
@@ -1833,77 +2009,12 @@
                 <w:sz w:val="19"/>
                 <w:szCs w:val="19"/>
               </w:rPr>
-              <w:t xml:space="preserve">Feature flag for Outlook email delivery (default false).</w:t>
-            </w:r>
-          </w:p>
-        </w:tc>
-      </w:tr>
-      <w:tr>
-        <w:tc>
-          <w:tcPr>
-            <w:shd w:fill="FFFFFF" w:color="auto" w:val="clear"/>
-            <w:tcMar>
-              <w:top w:type="dxa" w:w="70"/>
-              <w:left w:type="dxa" w:w="120"/>
-              <w:bottom w:type="dxa" w:w="70"/>
-              <w:right w:type="dxa" w:w="120"/>
-            </w:tcMar>
-          </w:tcPr>
-          <w:p>
-            <w:r>
-              <w:rPr>
-                <w:color w:val="222933"/>
-                <w:sz w:val="19"/>
-                <w:szCs w:val="19"/>
-              </w:rPr>
-              <w:t xml:space="preserve">NOTIFY_TEAMS_ENABLED</w:t>
-            </w:r>
-          </w:p>
-        </w:tc>
-        <w:tc>
-          <w:tcPr>
-            <w:shd w:fill="FFFFFF" w:color="auto" w:val="clear"/>
-            <w:tcMar>
-              <w:top w:type="dxa" w:w="70"/>
-              <w:left w:type="dxa" w:w="120"/>
-              <w:bottom w:type="dxa" w:w="70"/>
-              <w:right w:type="dxa" w:w="120"/>
-            </w:tcMar>
-          </w:tcPr>
-          <w:p>
-            <w:r>
-              <w:rPr>
-                <w:color w:val="222933"/>
-                <w:sz w:val="19"/>
-                <w:szCs w:val="19"/>
-              </w:rPr>
               <w:t xml:space="preserve">Feature flag for Microsoft Teams delivery (default false).</w:t>
             </w:r>
           </w:p>
         </w:tc>
       </w:tr>
     </w:tbl>
-    <w:p>
-      <w:r>
-        <w:br w:type="page"/>
-      </w:r>
-    </w:p>
-    <w:p>
-      <w:pPr>
-        <w:pStyle w:val="Heading1"/>
-        <w:spacing w:after="140" w:before="360"/>
-      </w:pPr>
-      <w:r>
-        <w:rPr>
-          <w:b/>
-          <w:bCs/>
-          <w:color w:val="1F2A44"/>
-          <w:sz w:val="30"/>
-          <w:szCs w:val="30"/>
-        </w:rPr>
-        <w:t xml:space="preserve">4. Notification system</w:t>
-      </w:r>
-    </w:p>
     <w:p>
       <w:pPr>
         <w:pStyle w:val="Heading2"/>
@@ -1917,7 +2028,7 @@
           <w:sz w:val="24"/>
           <w:szCs w:val="24"/>
         </w:rPr>
-        <w:t xml:space="preserve">4.1 Evaluation engine</w:t>
+        <w:t xml:space="preserve">3.4 Provisioning the Azure PostgreSQL database</w:t>
       </w:r>
     </w:p>
     <w:p>
@@ -1930,7 +2041,7 @@
           <w:sz w:val="21"/>
           <w:szCs w:val="21"/>
         </w:rPr>
-        <w:t xml:space="preserve">lib/notifications/evaluate.ts calls getExecutiveSummary(), compares each KPI and the portfolio against the last stored snapshot, and creates deduplicated alert events on worsening, recovery, or band-change transitions. The first run records a silent baseline.</w:t>
+        <w:t xml:space="preserve">Create an Azure Database for PostgreSQL Flexible Server in Canada East (same region as the App Service) with TLS enforced, then create a database (e.g. "kpi") and provision the tables. The app connects with the standard pg driver — no Azure-specific driver is required.</w:t>
       </w:r>
     </w:p>
     <w:p>
@@ -1948,7 +2059,7 @@
           <w:sz w:val="21"/>
           <w:szCs w:val="21"/>
         </w:rPr>
-        <w:t xml:space="preserve">Severity mapping: KPI red → critical, amber → warning, unavailable → warning, recovery → info; portfolio red/orange → critical, yellow → warning.</w:t>
+        <w:t xml:space="preserve">Provision the schema with the bundled DDL: psql "host=&lt;server&gt;.postgres.database.azure.com port=5432 dbname=kpi user=dbadmin sslmode=require" -f scripts/db/schema.sql (idempotent, safe to re-run).</w:t>
       </w:r>
     </w:p>
     <w:p>
@@ -1966,7 +2077,7 @@
           <w:sz w:val="21"/>
           <w:szCs w:val="21"/>
         </w:rPr>
-        <w:t xml:space="preserve">Deduplication: a stable fingerprint (scope | kpi | status | reporting month) prevents duplicate alerts on re-runs.</w:t>
+        <w:t xml:space="preserve">Password auth: put the credentials in DATABASE_URL with ?sslmode=require.</w:t>
       </w:r>
     </w:p>
     <w:p>
@@ -1984,7 +2095,25 @@
           <w:sz w:val="21"/>
           <w:szCs w:val="21"/>
         </w:rPr>
-        <w:t xml:space="preserve">Fan-out: each event creates one delivery per matching subscription and enabled channel; dashboard deliveries are immediate.</w:t>
+        <w:t xml:space="preserve">Entra ID auth (recommended for production): set AZURE_PG_USE_ENTRA=true and omit the password; the App Service managed identity mints a short-lived token per connection. Grant the identity a PostgreSQL role via Microsoft Entra admin.</w:t>
+      </w:r>
+    </w:p>
+    <w:p>
+      <w:pPr>
+        <w:pStyle w:val="ListParagraph"/>
+        <w:numPr>
+          <w:ilvl w:val="0"/>
+          <w:numId w:val="1"/>
+        </w:numPr>
+        <w:spacing w:after="60" w:line="276"/>
+      </w:pPr>
+      <w:r>
+        <w:rPr>
+          <w:color w:val="222933"/>
+          <w:sz w:val="21"/>
+          <w:szCs w:val="21"/>
+        </w:rPr>
+        <w:t xml:space="preserve">Data residency: keeping the server in Canada East co-locates the data with the app and satisfies the in-region requirement.</w:t>
       </w:r>
     </w:p>
     <w:p>
@@ -2000,7 +2129,248 @@
           <w:sz w:val="24"/>
           <w:szCs w:val="24"/>
         </w:rPr>
-        <w:t xml:space="preserve">4.2 Database tables (Neon / Drizzle)</w:t>
+        <w:t xml:space="preserve">3.5 Authentication and access control (Microsoft Entra ID)</w:t>
+      </w:r>
+    </w:p>
+    <w:p>
+      <w:pPr>
+        <w:spacing w:after="120" w:line="288"/>
+      </w:pPr>
+      <w:r>
+        <w:rPr>
+          <w:color w:val="222933"/>
+          <w:sz w:val="21"/>
+          <w:szCs w:val="21"/>
+        </w:rPr>
+        <w:t xml:space="preserve">Sign-in is handled by Azure App Service Authentication ("Easy Auth"), which validates the Entra ID login before the request reaches the app and injects the signed-in principal as request headers. The app reads that principal in lib/auth/easy-auth.ts — it never handles passwords, tokens, or client secrets.</w:t>
+      </w:r>
+    </w:p>
+    <w:p>
+      <w:pPr>
+        <w:pStyle w:val="ListParagraph"/>
+        <w:numPr>
+          <w:ilvl w:val="0"/>
+          <w:numId w:val="1"/>
+        </w:numPr>
+        <w:spacing w:after="60" w:line="276"/>
+      </w:pPr>
+      <w:r>
+        <w:rPr>
+          <w:color w:val="222933"/>
+          <w:sz w:val="21"/>
+          <w:szCs w:val="21"/>
+        </w:rPr>
+        <w:t xml:space="preserve">Enable: on the App Service, turn on Authentication, add the Microsoft identity provider, and set unauthenticated requests to require login. Set AUTH_REQUIRE_ENTRA=true so the app's proxy also redirects any unauthenticated page request to Entra.</w:t>
+      </w:r>
+    </w:p>
+    <w:p>
+      <w:pPr>
+        <w:pStyle w:val="ListParagraph"/>
+        <w:numPr>
+          <w:ilvl w:val="0"/>
+          <w:numId w:val="1"/>
+        </w:numPr>
+        <w:spacing w:after="60" w:line="276"/>
+      </w:pPr>
+      <w:r>
+        <w:rPr>
+          <w:color w:val="222933"/>
+          <w:sz w:val="21"/>
+          <w:szCs w:val="21"/>
+        </w:rPr>
+        <w:t xml:space="preserve">Roles: define three App Roles on the Entra app registration — Admin, Manager, Viewer — and assign users or security groups to them. The app maps any role containing "admin" to admin, "manager" to manager, and everything else to viewer; the highest role wins.</w:t>
+      </w:r>
+    </w:p>
+    <w:p>
+      <w:pPr>
+        <w:pStyle w:val="ListParagraph"/>
+        <w:numPr>
+          <w:ilvl w:val="0"/>
+          <w:numId w:val="1"/>
+        </w:numPr>
+        <w:spacing w:after="60" w:line="276"/>
+      </w:pPr>
+      <w:r>
+        <w:rPr>
+          <w:color w:val="222933"/>
+          <w:sz w:val="21"/>
+          <w:szCs w:val="21"/>
+        </w:rPr>
+        <w:t xml:space="preserve">Role of record: on each sign-in the user's role from Entra is synced to app_user, so directory changes take effect on next login. Identity is keyed by the Entra object id (oid).</w:t>
+      </w:r>
+    </w:p>
+    <w:p>
+      <w:pPr>
+        <w:pStyle w:val="ListParagraph"/>
+        <w:numPr>
+          <w:ilvl w:val="0"/>
+          <w:numId w:val="1"/>
+        </w:numPr>
+        <w:spacing w:after="60" w:line="276"/>
+      </w:pPr>
+      <w:r>
+        <w:rPr>
+          <w:color w:val="222933"/>
+          <w:sz w:val="21"/>
+          <w:szCs w:val="21"/>
+        </w:rPr>
+        <w:t xml:space="preserve">What roles gate: every authenticated user can view all 21 KPIs and manage their own subscriptions. Manager and Admin can additionally run evaluations ("Check now"); Admin is reserved for assignment and audit review (Phase 5).</w:t>
+      </w:r>
+    </w:p>
+    <w:p>
+      <w:pPr>
+        <w:pStyle w:val="ListParagraph"/>
+        <w:numPr>
+          <w:ilvl w:val="0"/>
+          <w:numId w:val="1"/>
+        </w:numPr>
+        <w:spacing w:after="60" w:line="276"/>
+      </w:pPr>
+      <w:r>
+        <w:rPr>
+          <w:color w:val="222933"/>
+          <w:sz w:val="21"/>
+          <w:szCs w:val="21"/>
+        </w:rPr>
+        <w:t xml:space="preserve">Local dev / preview: with no Easy Auth in front of the app, it falls back to the NOTIFY_DEV_USER_* identity so the UI stays fully functional. This fallback is never used once a real Entra user is signed in.</w:t>
+      </w:r>
+    </w:p>
+    <w:p>
+      <w:pPr>
+        <w:pStyle w:val="ListParagraph"/>
+        <w:numPr>
+          <w:ilvl w:val="0"/>
+          <w:numId w:val="1"/>
+        </w:numPr>
+        <w:spacing w:after="60" w:line="276"/>
+      </w:pPr>
+      <w:r>
+        <w:rPr>
+          <w:color w:val="222933"/>
+          <w:sz w:val="21"/>
+          <w:szCs w:val="21"/>
+        </w:rPr>
+        <w:t xml:space="preserve">Sign-out: the profile menu links to /.auth/logout, App Service's Easy Auth logout endpoint.</w:t>
+      </w:r>
+    </w:p>
+    <w:p>
+      <w:r>
+        <w:br w:type="page"/>
+      </w:r>
+    </w:p>
+    <w:p>
+      <w:pPr>
+        <w:pStyle w:val="Heading1"/>
+        <w:spacing w:after="140" w:before="360"/>
+      </w:pPr>
+      <w:r>
+        <w:rPr>
+          <w:b/>
+          <w:bCs/>
+          <w:color w:val="1F2A44"/>
+          <w:sz w:val="30"/>
+          <w:szCs w:val="30"/>
+        </w:rPr>
+        <w:t xml:space="preserve">4. Notification system</w:t>
+      </w:r>
+    </w:p>
+    <w:p>
+      <w:pPr>
+        <w:pStyle w:val="Heading2"/>
+        <w:spacing w:after="100" w:before="260"/>
+      </w:pPr>
+      <w:r>
+        <w:rPr>
+          <w:b/>
+          <w:bCs/>
+          <w:color w:val="1F2A44"/>
+          <w:sz w:val="24"/>
+          <w:szCs w:val="24"/>
+        </w:rPr>
+        <w:t xml:space="preserve">4.1 Evaluation engine</w:t>
+      </w:r>
+    </w:p>
+    <w:p>
+      <w:pPr>
+        <w:spacing w:after="120" w:line="288"/>
+      </w:pPr>
+      <w:r>
+        <w:rPr>
+          <w:color w:val="222933"/>
+          <w:sz w:val="21"/>
+          <w:szCs w:val="21"/>
+        </w:rPr>
+        <w:t xml:space="preserve">lib/notifications/evaluate.ts calls getExecutiveSummary(), compares each KPI and the portfolio against the last stored snapshot, and creates deduplicated alert events on worsening, recovery, or band-change transitions. The first run records a silent baseline.</w:t>
+      </w:r>
+    </w:p>
+    <w:p>
+      <w:pPr>
+        <w:pStyle w:val="ListParagraph"/>
+        <w:numPr>
+          <w:ilvl w:val="0"/>
+          <w:numId w:val="1"/>
+        </w:numPr>
+        <w:spacing w:after="60" w:line="276"/>
+      </w:pPr>
+      <w:r>
+        <w:rPr>
+          <w:color w:val="222933"/>
+          <w:sz w:val="21"/>
+          <w:szCs w:val="21"/>
+        </w:rPr>
+        <w:t xml:space="preserve">Severity mapping: KPI red → critical, amber → warning, unavailable → warning, recovery → info; portfolio red/orange → critical, yellow → warning.</w:t>
+      </w:r>
+    </w:p>
+    <w:p>
+      <w:pPr>
+        <w:pStyle w:val="ListParagraph"/>
+        <w:numPr>
+          <w:ilvl w:val="0"/>
+          <w:numId w:val="1"/>
+        </w:numPr>
+        <w:spacing w:after="60" w:line="276"/>
+      </w:pPr>
+      <w:r>
+        <w:rPr>
+          <w:color w:val="222933"/>
+          <w:sz w:val="21"/>
+          <w:szCs w:val="21"/>
+        </w:rPr>
+        <w:t xml:space="preserve">Deduplication: a stable fingerprint (scope | kpi | status | reporting month) prevents duplicate alerts on re-runs.</w:t>
+      </w:r>
+    </w:p>
+    <w:p>
+      <w:pPr>
+        <w:pStyle w:val="ListParagraph"/>
+        <w:numPr>
+          <w:ilvl w:val="0"/>
+          <w:numId w:val="1"/>
+        </w:numPr>
+        <w:spacing w:after="60" w:line="276"/>
+      </w:pPr>
+      <w:r>
+        <w:rPr>
+          <w:color w:val="222933"/>
+          <w:sz w:val="21"/>
+          <w:szCs w:val="21"/>
+        </w:rPr>
+        <w:t xml:space="preserve">Fan-out: each event creates one delivery per matching subscription and enabled channel; dashboard deliveries are immediate.</w:t>
+      </w:r>
+    </w:p>
+    <w:p>
+      <w:pPr>
+        <w:pStyle w:val="Heading2"/>
+        <w:spacing w:after="100" w:before="260"/>
+      </w:pPr>
+      <w:r>
+        <w:rPr>
+          <w:b/>
+          <w:bCs/>
+          <w:color w:val="1F2A44"/>
+          <w:sz w:val="24"/>
+          <w:szCs w:val="24"/>
+        </w:rPr>
+        <w:t xml:space="preserve">4.2 Database tables (Azure PostgreSQL / Drizzle)</w:t>
       </w:r>
     </w:p>
     <w:tbl>
@@ -2902,7 +3272,7 @@
           <w:sz w:val="21"/>
           <w:szCs w:val="21"/>
         </w:rPr>
-        <w:t xml:space="preserve">Preferences are stored per user (Neon), so they follow the account across devices.</w:t>
+        <w:t xml:space="preserve">Preferences are stored per user (Azure PostgreSQL), so they follow the account across devices.</w:t>
       </w:r>
     </w:p>
     <w:p>
@@ -3065,7 +3435,7 @@
           <w:sz w:val="21"/>
           <w:szCs w:val="21"/>
         </w:rPr>
-        <w:t xml:space="preserve">Watch Vercel logs and Neon metrics; alert on evaluation endpoint failures and Graph download errors.</w:t>
+        <w:t xml:space="preserve">Watch application logs and Azure PostgreSQL metrics (Azure Monitor); alert on evaluation endpoint failures and Graph download errors.</w:t>
       </w:r>
     </w:p>
     <w:p>
@@ -3454,7 +3824,7 @@
                 <w:sz w:val="19"/>
                 <w:szCs w:val="19"/>
               </w:rPr>
-              <w:t xml:space="preserve">Neon client + Drizzle schema.</w:t>
+              <w:t xml:space="preserve">Azure PostgreSQL client (pg + optional Entra auth) + Drizzle schema.</w:t>
             </w:r>
           </w:p>
         </w:tc>

</xml_diff>